<commit_message>
chore(templates): update contract templates and forms (#845)
Routine refresh of contract template and external-form artifacts and catalog metadata. Contributions are welcome — open an issue or pull request and we'll fold it in.

Co-authored-by: OpenAgreements <noreply@openagreements.org>
Co-authored-by: Steven Obiajulu <steven@usejunior.com>
</commit_message>
<xml_diff>
--- a/templates/openagreements-cc-by-4.0/openagreements-employment-offer-letter/template.docx
+++ b/templates/openagreements-cc-by-4.0/openagreements-employment-offer-letter/template.docx
@@ -592,11 +592,14 @@
             <w:r>
               <w:rPr>
                 <w:rFonts w:ascii="Arial" w:hAnsi="Arial" w:cs="Arial"/>
-                <w:color w:val="1D2021"/>
-                <w:sz w:val="22"/>
-                <w:szCs w:val="22"/>
-              </w:rPr>
-              <w:t xml:space="preserve">California</w:t>
+                <w:b/>
+                <w:bCs/>
+                <w:color w:val="1D2021"/>
+                <w:sz w:val="22"/>
+                <w:szCs w:val="22"/>
+                <w:highlight w:val="yellow"/>
+              </w:rPr>
+              <w:t xml:space="preserve">[Governing law state for the offer letter; must be selected explicitly for the employee’s circumstances]</w:t>
             </w:r>
           </w:p>
         </w:tc>

</xml_diff>